<commit_message>
Replace meaningless sensor pie chart (Fig. 7) with feature correlation heatmap
The sensor_contribution pie chart showed 25% for all 4 sensors (trivially equal
since 216 features / 4 sensors = 54 each). Replaced with the top-50 feature
correlation matrix which reveals meaningful redundancy patterns across sensors.

Co-Authored-By: Claude Opus 4.6 <noreply@anthropic.com>
</commit_message>
<xml_diff>
--- a/results/Final_Report_Track_A.docx
+++ b/results/Final_Report_Track_A.docx
@@ -6349,9 +6349,9 @@
       <w:r>
         <w:drawing>
           <wp:inline distT="0" distB="0" distL="0" distR="0">
-            <wp:extent cx="4191000" cy="4429125"/>
+            <wp:extent cx="4572000" cy="4076700"/>
             <wp:effectExtent t="0" r="0" b="0" l="0"/>
-            <wp:docPr id="1" name="PHASE1_Feature_Analysis_COMPLETE/Full_Gait_6s_ov50/sensor_contribution_Full_Gait_6s_ov50.png" descr="PHASE1_Feature_Analysis_COMPLETE/Full_Gait_6s_ov50/sensor_contribution_Full_Gait_6s_ov50.png" title="PHASE1_Feature_Analysis_COMPLETE/Full_Gait_6s_ov50/sensor_contribution_Full_Gait_6s_ov50.png"/>
+            <wp:docPr id="1" name="PHASE1_Feature_Analysis_COMPLETE/Full_Gait_6s_ov50/correlation_heatmap_Full_Gait_6s_ov50.png" descr="PHASE1_Feature_Analysis_COMPLETE/Full_Gait_6s_ov50/correlation_heatmap_Full_Gait_6s_ov50.png" title="PHASE1_Feature_Analysis_COMPLETE/Full_Gait_6s_ov50/correlation_heatmap_Full_Gait_6s_ov50.png"/>
             <wp:cNvGraphicFramePr>
               <a:graphicFrameLocks xmlns:a="http://schemas.openxmlformats.org/drawingml/2006/main" noChangeAspect="1"/>
             </wp:cNvGraphicFramePr>
@@ -6374,7 +6374,7 @@
                   <pic:spPr bwMode="auto">
                     <a:xfrm>
                       <a:off x="0" y="0"/>
-                      <a:ext cx="4191000" cy="4429125"/>
+                      <a:ext cx="4572000" cy="4076700"/>
                     </a:xfrm>
                     <a:prstGeom prst="rect">
                       <a:avLst/>
@@ -6408,7 +6408,7 @@
           <w:sz w:val="18"/>
           <w:szCs w:val="18"/>
         </w:rPr>
-        <w:t xml:space="preserve">Sensor contribution analysis (Kruskal–Wallis η²). HE features consistently show higher discriminative power across signal types.</w:t>
+        <w:t xml:space="preserve">Pearson correlation matrix of top 50 features (Full Gait 6s, 50% overlap). Highly correlated feature clusters indicate redundancy across sensor–axis combinations, motivating feature selection.</w:t>
       </w:r>
     </w:p>
     <w:p>

</xml_diff>